<commit_message>
Contract generation for some employees and some bug fixes
</commit_message>
<xml_diff>
--- a/wwwroot/Templates/Zal nəzarətçisi-müqavile2024.docx
+++ b/wwwroot/Templates/Zal nəzarətçisi-müqavile2024.docx
@@ -6,6 +6,7 @@
       <w:pPr>
         <w:pStyle w:val="Heading2"/>
         <w:spacing w:line="276" w:lineRule="auto"/>
+        <w:jc w:val="left"/>
         <w:rPr>
           <w:rFonts w:ascii="Arial" w:hAnsi="Arial" w:cs="Arial"/>
           <w:color w:val="000000" w:themeColor="text1"/>
@@ -272,8 +273,6 @@
         </w:rPr>
         <w:t>Tarix:</w:t>
       </w:r>
-      <w:bookmarkStart w:id="0" w:name="_GoBack"/>
-      <w:bookmarkEnd w:id="0"/>
     </w:p>
     <w:p>
       <w:pPr>
@@ -556,7 +555,7 @@
           <w:szCs w:val="24"/>
           <w:lang w:val="az-Latn-AZ"/>
         </w:rPr>
-        <w:t>_____________________________________________</w:t>
+        <w:t>___</w:t>
       </w:r>
       <w:r>
         <w:rPr>
@@ -566,17 +565,7 @@
           <w:szCs w:val="24"/>
           <w:lang w:val="az-Latn-AZ"/>
         </w:rPr>
-        <w:t>_______________</w:t>
-      </w:r>
-      <w:r>
-        <w:rPr>
-          <w:rFonts w:ascii="Arial" w:hAnsi="Arial" w:cs="Arial"/>
-          <w:b w:val="0"/>
-          <w:i w:val="0"/>
-          <w:szCs w:val="24"/>
-          <w:lang w:val="az-Latn-AZ"/>
-        </w:rPr>
-        <w:t>__</w:t>
+        <w:t xml:space="preserve"> </w:t>
       </w:r>
       <w:r>
         <w:rPr>
@@ -2535,7 +2524,6 @@
           <w:szCs w:val="24"/>
           <w:lang w:val="az-Latn-AZ"/>
         </w:rPr>
-        <w:lastRenderedPageBreak/>
         <w:t>4</w:t>
       </w:r>
       <w:r>
@@ -2569,6 +2557,7 @@
           <w:szCs w:val="24"/>
           <w:lang w:val="az-Latn-AZ"/>
         </w:rPr>
+        <w:lastRenderedPageBreak/>
         <w:t>4</w:t>
       </w:r>
       <w:r>
@@ -3315,6 +3304,14 @@
         <w:tblStyle w:val="TableGrid"/>
         <w:tblpPr w:leftFromText="180" w:rightFromText="180" w:vertAnchor="text" w:horzAnchor="margin" w:tblpXSpec="right" w:tblpY="-11"/>
         <w:tblW w:w="0" w:type="auto"/>
+        <w:tblBorders>
+          <w:top w:val="none" w:sz="0" w:space="0" w:color="auto"/>
+          <w:left w:val="none" w:sz="0" w:space="0" w:color="auto"/>
+          <w:bottom w:val="none" w:sz="0" w:space="0" w:color="auto"/>
+          <w:right w:val="none" w:sz="0" w:space="0" w:color="auto"/>
+          <w:insideH w:val="none" w:sz="0" w:space="0" w:color="auto"/>
+          <w:insideV w:val="none" w:sz="0" w:space="0" w:color="auto"/>
+        </w:tblBorders>
         <w:tblLayout w:type="fixed"/>
         <w:tblLook w:val="04A0" w:firstRow="1" w:lastRow="0" w:firstColumn="1" w:lastColumn="0" w:noHBand="0" w:noVBand="1"/>
       </w:tblPr>
@@ -3325,12 +3322,6 @@
         <w:tc>
           <w:tcPr>
             <w:tcW w:w="5954" w:type="dxa"/>
-            <w:tcBorders>
-              <w:top w:val="nil"/>
-              <w:left w:val="nil"/>
-              <w:bottom w:val="nil"/>
-              <w:right w:val="nil"/>
-            </w:tcBorders>
             <w:vAlign w:val="center"/>
           </w:tcPr>
           <w:p>
@@ -3361,12 +3352,6 @@
         <w:tc>
           <w:tcPr>
             <w:tcW w:w="5954" w:type="dxa"/>
-            <w:tcBorders>
-              <w:top w:val="nil"/>
-              <w:left w:val="nil"/>
-              <w:bottom w:val="single" w:sz="4" w:space="0" w:color="auto"/>
-              <w:right w:val="nil"/>
-            </w:tcBorders>
           </w:tcPr>
           <w:p>
             <w:pPr>
@@ -3385,19 +3370,12 @@
         <w:tc>
           <w:tcPr>
             <w:tcW w:w="5954" w:type="dxa"/>
-            <w:tcBorders>
-              <w:top w:val="single" w:sz="4" w:space="0" w:color="auto"/>
-              <w:left w:val="nil"/>
-              <w:bottom w:val="nil"/>
-              <w:right w:val="nil"/>
-            </w:tcBorders>
           </w:tcPr>
           <w:p>
             <w:pPr>
-              <w:jc w:val="center"/>
-              <w:rPr>
-                <w:rFonts w:ascii="Arial" w:hAnsi="Arial" w:cs="Arial"/>
-                <w:sz w:val="24"/>
+              <w:rPr>
+                <w:rFonts w:ascii="Arial" w:hAnsi="Arial" w:cs="Arial"/>
+                <w:sz w:val="22"/>
                 <w:szCs w:val="24"/>
                 <w:lang w:val="az-Latn-AZ"/>
               </w:rPr>
@@ -3409,7 +3387,34 @@
                 <w:szCs w:val="24"/>
                 <w:lang w:val="az-Latn-AZ"/>
               </w:rPr>
-              <w:t>adı, soyadı, atasının adı</w:t>
+              <w:t>S</w:t>
+            </w:r>
+            <w:r>
+              <w:rPr>
+                <w:rFonts w:ascii="Arial" w:hAnsi="Arial" w:cs="Arial"/>
+                <w:sz w:val="22"/>
+                <w:szCs w:val="24"/>
+                <w:lang w:val="az-Latn-AZ"/>
+              </w:rPr>
+              <w:t>oyadı,</w:t>
+            </w:r>
+            <w:r>
+              <w:rPr>
+                <w:rFonts w:ascii="Arial" w:hAnsi="Arial" w:cs="Arial"/>
+                <w:sz w:val="22"/>
+                <w:szCs w:val="24"/>
+                <w:lang w:val="az-Latn-AZ"/>
+              </w:rPr>
+              <w:t xml:space="preserve"> adı, </w:t>
+            </w:r>
+            <w:r>
+              <w:rPr>
+                <w:rFonts w:ascii="Arial" w:hAnsi="Arial" w:cs="Arial"/>
+                <w:sz w:val="22"/>
+                <w:szCs w:val="24"/>
+                <w:lang w:val="az-Latn-AZ"/>
+              </w:rPr>
+              <w:t>atasının adı</w:t>
             </w:r>
           </w:p>
         </w:tc>
@@ -3418,16 +3423,9 @@
         <w:tc>
           <w:tcPr>
             <w:tcW w:w="5954" w:type="dxa"/>
-            <w:tcBorders>
-              <w:top w:val="nil"/>
-              <w:left w:val="nil"/>
-              <w:bottom w:val="single" w:sz="4" w:space="0" w:color="auto"/>
-              <w:right w:val="nil"/>
-            </w:tcBorders>
           </w:tcPr>
           <w:p>
             <w:pPr>
-              <w:jc w:val="both"/>
               <w:rPr>
                 <w:rFonts w:ascii="Arial" w:hAnsi="Arial" w:cs="Arial"/>
                 <w:sz w:val="24"/>
@@ -3442,15 +3440,9 @@
         <w:tc>
           <w:tcPr>
             <w:tcW w:w="5954" w:type="dxa"/>
-            <w:tcBorders>
-              <w:left w:val="nil"/>
-              <w:bottom w:val="nil"/>
-              <w:right w:val="nil"/>
-            </w:tcBorders>
           </w:tcPr>
           <w:p>
             <w:pPr>
-              <w:jc w:val="center"/>
               <w:rPr>
                 <w:rFonts w:ascii="Arial" w:hAnsi="Arial" w:cs="Arial"/>
                 <w:sz w:val="22"/>
@@ -3465,7 +3457,16 @@
                 <w:szCs w:val="24"/>
                 <w:lang w:val="az-Latn-AZ"/>
               </w:rPr>
-              <w:t>şəxsiyyət vəsiqəsinin FİN kodu</w:t>
+              <w:t>Ş</w:t>
+            </w:r>
+            <w:r>
+              <w:rPr>
+                <w:rFonts w:ascii="Arial" w:hAnsi="Arial" w:cs="Arial"/>
+                <w:sz w:val="22"/>
+                <w:szCs w:val="24"/>
+                <w:lang w:val="az-Latn-AZ"/>
+              </w:rPr>
+              <w:t>əxsiyyət vəsiqəsinin FİN kodu</w:t>
             </w:r>
           </w:p>
         </w:tc>
@@ -3474,12 +3475,6 @@
         <w:tc>
           <w:tcPr>
             <w:tcW w:w="5954" w:type="dxa"/>
-            <w:tcBorders>
-              <w:top w:val="nil"/>
-              <w:left w:val="nil"/>
-              <w:bottom w:val="single" w:sz="4" w:space="0" w:color="auto"/>
-              <w:right w:val="nil"/>
-            </w:tcBorders>
           </w:tcPr>
           <w:p>
             <w:pPr>
@@ -3497,15 +3492,9 @@
         <w:tc>
           <w:tcPr>
             <w:tcW w:w="5954" w:type="dxa"/>
-            <w:tcBorders>
-              <w:left w:val="nil"/>
-              <w:bottom w:val="nil"/>
-              <w:right w:val="nil"/>
-            </w:tcBorders>
           </w:tcPr>
           <w:p>
             <w:pPr>
-              <w:jc w:val="center"/>
               <w:rPr>
                 <w:rFonts w:ascii="Arial" w:hAnsi="Arial" w:cs="Arial"/>
                 <w:sz w:val="22"/>
@@ -3529,12 +3518,6 @@
         <w:tc>
           <w:tcPr>
             <w:tcW w:w="5954" w:type="dxa"/>
-            <w:tcBorders>
-              <w:top w:val="nil"/>
-              <w:left w:val="nil"/>
-              <w:bottom w:val="single" w:sz="4" w:space="0" w:color="auto"/>
-              <w:right w:val="nil"/>
-            </w:tcBorders>
           </w:tcPr>
           <w:p>
             <w:pPr>
@@ -3552,15 +3535,9 @@
         <w:tc>
           <w:tcPr>
             <w:tcW w:w="5954" w:type="dxa"/>
-            <w:tcBorders>
-              <w:left w:val="nil"/>
-              <w:bottom w:val="nil"/>
-              <w:right w:val="nil"/>
-            </w:tcBorders>
           </w:tcPr>
           <w:p>
             <w:pPr>
-              <w:jc w:val="center"/>
               <w:rPr>
                 <w:rFonts w:ascii="Arial" w:hAnsi="Arial" w:cs="Arial"/>
                 <w:sz w:val="22"/>
@@ -3580,7 +3557,6 @@
           </w:p>
           <w:p>
             <w:pPr>
-              <w:jc w:val="center"/>
               <w:rPr>
                 <w:rFonts w:ascii="Arial" w:hAnsi="Arial" w:cs="Arial"/>
                 <w:sz w:val="22"/>
@@ -3595,107 +3571,28 @@
         <w:tc>
           <w:tcPr>
             <w:tcW w:w="5954" w:type="dxa"/>
-            <w:tcBorders>
-              <w:top w:val="nil"/>
-              <w:left w:val="nil"/>
-              <w:bottom w:val="nil"/>
-              <w:right w:val="nil"/>
-            </w:tcBorders>
           </w:tcPr>
           <w:p>
             <w:pPr>
-              <w:jc w:val="center"/>
-              <w:rPr>
-                <w:rFonts w:ascii="Arial" w:hAnsi="Arial" w:cs="Arial"/>
-                <w:b/>
-                <w:bCs/>
+              <w:rPr>
+                <w:rFonts w:ascii="Arial" w:hAnsi="Arial" w:cs="Arial"/>
                 <w:sz w:val="22"/>
                 <w:szCs w:val="24"/>
-                <w:lang w:val="en-US"/>
+                <w:lang w:val="az-Latn-AZ"/>
               </w:rPr>
             </w:pPr>
             <w:r>
               <w:rPr>
                 <w:rFonts w:ascii="Arial" w:hAnsi="Arial" w:cs="Arial"/>
-                <w:b/>
-                <w:bCs/>
                 <w:sz w:val="22"/>
                 <w:szCs w:val="24"/>
                 <w:lang w:val="az-Latn-AZ"/>
               </w:rPr>
-              <w:t>Bank rekvizitləri</w:t>
-            </w:r>
-            <w:r>
-              <w:rPr>
-                <w:rFonts w:ascii="Arial" w:hAnsi="Arial" w:cs="Arial"/>
-                <w:b/>
-                <w:bCs/>
-                <w:sz w:val="22"/>
-                <w:szCs w:val="24"/>
-                <w:lang w:val="en-US"/>
-              </w:rPr>
-              <w:t xml:space="preserve">: </w:t>
+              <w:t>Bankın Adı</w:t>
             </w:r>
           </w:p>
           <w:p>
             <w:pPr>
-              <w:pBdr>
-                <w:bottom w:val="single" w:sz="4" w:space="1" w:color="auto"/>
-              </w:pBdr>
-              <w:jc w:val="center"/>
-              <w:rPr>
-                <w:rFonts w:ascii="Arial" w:hAnsi="Arial" w:cs="Arial"/>
-                <w:sz w:val="22"/>
-                <w:szCs w:val="24"/>
-                <w:lang w:val="en-US"/>
-              </w:rPr>
-            </w:pPr>
-          </w:p>
-          <w:p>
-            <w:pPr>
-              <w:jc w:val="center"/>
-              <w:rPr>
-                <w:rFonts w:ascii="Arial" w:hAnsi="Arial" w:cs="Arial"/>
-                <w:sz w:val="22"/>
-                <w:szCs w:val="24"/>
-                <w:lang w:val="az-Latn-AZ"/>
-              </w:rPr>
-            </w:pPr>
-            <w:r>
-              <w:rPr>
-                <w:rFonts w:ascii="Arial" w:hAnsi="Arial" w:cs="Arial"/>
-                <w:sz w:val="22"/>
-                <w:szCs w:val="24"/>
-                <w:lang w:val="en-US"/>
-              </w:rPr>
-              <w:t>Bankın ad</w:t>
-            </w:r>
-            <w:r>
-              <w:rPr>
-                <w:rFonts w:ascii="Arial" w:hAnsi="Arial" w:cs="Arial"/>
-                <w:sz w:val="22"/>
-                <w:szCs w:val="24"/>
-                <w:lang w:val="az-Latn-AZ"/>
-              </w:rPr>
-              <w:t>ı</w:t>
-            </w:r>
-          </w:p>
-        </w:tc>
-      </w:tr>
-      <w:tr>
-        <w:tc>
-          <w:tcPr>
-            <w:tcW w:w="5954" w:type="dxa"/>
-            <w:tcBorders>
-              <w:top w:val="nil"/>
-              <w:left w:val="nil"/>
-              <w:bottom w:val="single" w:sz="4" w:space="0" w:color="auto"/>
-              <w:right w:val="nil"/>
-            </w:tcBorders>
-          </w:tcPr>
-          <w:p>
-            <w:pPr>
-              <w:jc w:val="center"/>
               <w:rPr>
                 <w:rFonts w:ascii="Arial" w:hAnsi="Arial" w:cs="Arial"/>
                 <w:sz w:val="22"/>
@@ -3710,15 +3607,9 @@
         <w:tc>
           <w:tcPr>
             <w:tcW w:w="5954" w:type="dxa"/>
-            <w:tcBorders>
-              <w:left w:val="nil"/>
-              <w:bottom w:val="nil"/>
-              <w:right w:val="nil"/>
-            </w:tcBorders>
           </w:tcPr>
           <w:p>
             <w:pPr>
-              <w:jc w:val="center"/>
               <w:rPr>
                 <w:rFonts w:ascii="Arial" w:hAnsi="Arial" w:cs="Arial"/>
                 <w:sz w:val="22"/>
@@ -3742,16 +3633,9 @@
         <w:tc>
           <w:tcPr>
             <w:tcW w:w="5954" w:type="dxa"/>
-            <w:tcBorders>
-              <w:top w:val="nil"/>
-              <w:left w:val="nil"/>
-              <w:bottom w:val="single" w:sz="4" w:space="0" w:color="auto"/>
-              <w:right w:val="nil"/>
-            </w:tcBorders>
           </w:tcPr>
           <w:p>
             <w:pPr>
-              <w:jc w:val="center"/>
               <w:rPr>
                 <w:rFonts w:ascii="Arial" w:hAnsi="Arial" w:cs="Arial"/>
                 <w:sz w:val="22"/>
@@ -3766,15 +3650,9 @@
         <w:tc>
           <w:tcPr>
             <w:tcW w:w="5954" w:type="dxa"/>
-            <w:tcBorders>
-              <w:left w:val="nil"/>
-              <w:bottom w:val="single" w:sz="4" w:space="0" w:color="auto"/>
-              <w:right w:val="nil"/>
-            </w:tcBorders>
           </w:tcPr>
           <w:p>
             <w:pPr>
-              <w:jc w:val="center"/>
               <w:rPr>
                 <w:rFonts w:ascii="Arial" w:hAnsi="Arial" w:cs="Arial"/>
                 <w:sz w:val="22"/>
@@ -3795,7 +3673,6 @@
           <w:p>
             <w:pPr>
               <w:ind w:left="-537" w:right="-536"/>
-              <w:jc w:val="center"/>
               <w:rPr>
                 <w:rFonts w:ascii="Arial" w:hAnsi="Arial" w:cs="Arial"/>
                 <w:sz w:val="22"/>
@@ -3810,15 +3687,9 @@
         <w:tc>
           <w:tcPr>
             <w:tcW w:w="5954" w:type="dxa"/>
-            <w:tcBorders>
-              <w:left w:val="nil"/>
-              <w:bottom w:val="nil"/>
-              <w:right w:val="nil"/>
-            </w:tcBorders>
           </w:tcPr>
           <w:p>
             <w:pPr>
-              <w:jc w:val="center"/>
               <w:rPr>
                 <w:rFonts w:ascii="Arial" w:hAnsi="Arial" w:cs="Arial"/>
                 <w:sz w:val="22"/>
@@ -3834,6 +3705,55 @@
                 <w:lang w:val="az-Latn-AZ"/>
               </w:rPr>
               <w:t>Hesab nömrəsi</w:t>
+            </w:r>
+            <w:bookmarkStart w:id="0" w:name="_GoBack"/>
+            <w:bookmarkEnd w:id="0"/>
+          </w:p>
+        </w:tc>
+      </w:tr>
+      <w:tr>
+        <w:tc>
+          <w:tcPr>
+            <w:tcW w:w="5954" w:type="dxa"/>
+          </w:tcPr>
+          <w:p>
+            <w:pPr>
+              <w:jc w:val="both"/>
+              <w:rPr>
+                <w:rFonts w:ascii="Arial" w:hAnsi="Arial" w:cs="Arial"/>
+                <w:sz w:val="22"/>
+                <w:szCs w:val="24"/>
+                <w:lang w:val="az-Latn-AZ"/>
+              </w:rPr>
+            </w:pPr>
+          </w:p>
+          <w:p>
+            <w:pPr>
+              <w:jc w:val="center"/>
+              <w:rPr>
+                <w:rFonts w:ascii="Arial" w:hAnsi="Arial" w:cs="Arial"/>
+                <w:sz w:val="22"/>
+                <w:szCs w:val="24"/>
+                <w:lang w:val="az-Latn-AZ"/>
+              </w:rPr>
+            </w:pPr>
+            <w:r>
+              <w:rPr>
+                <w:rFonts w:ascii="Arial" w:hAnsi="Arial" w:cs="Arial"/>
+                <w:sz w:val="22"/>
+                <w:szCs w:val="24"/>
+                <w:lang w:val="az-Latn-AZ"/>
+              </w:rPr>
+              <w:t>______________</w:t>
+            </w:r>
+            <w:r>
+              <w:rPr>
+                <w:rFonts w:ascii="Arial" w:hAnsi="Arial" w:cs="Arial"/>
+                <w:sz w:val="22"/>
+                <w:szCs w:val="24"/>
+                <w:lang w:val="az-Latn-AZ"/>
+              </w:rPr>
+              <w:t>____</w:t>
             </w:r>
           </w:p>
         </w:tc>
@@ -3842,46 +3762,6 @@
         <w:tc>
           <w:tcPr>
             <w:tcW w:w="5954" w:type="dxa"/>
-            <w:tcBorders>
-              <w:top w:val="nil"/>
-              <w:left w:val="nil"/>
-              <w:bottom w:val="single" w:sz="4" w:space="0" w:color="auto"/>
-              <w:right w:val="nil"/>
-            </w:tcBorders>
-          </w:tcPr>
-          <w:p>
-            <w:pPr>
-              <w:jc w:val="both"/>
-              <w:rPr>
-                <w:rFonts w:ascii="Arial" w:hAnsi="Arial" w:cs="Arial"/>
-                <w:sz w:val="22"/>
-                <w:szCs w:val="24"/>
-                <w:lang w:val="az-Latn-AZ"/>
-              </w:rPr>
-            </w:pPr>
-          </w:p>
-          <w:p>
-            <w:pPr>
-              <w:jc w:val="both"/>
-              <w:rPr>
-                <w:rFonts w:ascii="Arial" w:hAnsi="Arial" w:cs="Arial"/>
-                <w:sz w:val="22"/>
-                <w:szCs w:val="24"/>
-                <w:lang w:val="az-Latn-AZ"/>
-              </w:rPr>
-            </w:pPr>
-          </w:p>
-        </w:tc>
-      </w:tr>
-      <w:tr>
-        <w:tc>
-          <w:tcPr>
-            <w:tcW w:w="5954" w:type="dxa"/>
-            <w:tcBorders>
-              <w:left w:val="nil"/>
-              <w:bottom w:val="nil"/>
-              <w:right w:val="nil"/>
-            </w:tcBorders>
             <w:vAlign w:val="bottom"/>
           </w:tcPr>
           <w:p>

</xml_diff>